<commit_message>
Update final competition deliverables
</commit_message>
<xml_diff>
--- a/deliverables/ReproGuard技术报告-模板版.docx
+++ b/deliverables/ReproGuard技术报告-模板版.docx
@@ -39,7 +39,7 @@
         <w:rPr>
           <w:rFonts w:ascii="宋体" w:hAnsi="宋体" w:eastAsia="宋体"/>
           <w:b/>
-          <w:color w:val="1F4E79"/>
+          <w:color w:val="000000"/>
           <w:sz w:val="36"/>
         </w:rPr>
         <w:t>算法主题赛</w:t>
@@ -54,7 +54,7 @@
         <w:rPr>
           <w:rFonts w:ascii="宋体" w:hAnsi="宋体" w:eastAsia="宋体"/>
           <w:b/>
-          <w:color w:val="1F4E79"/>
+          <w:color w:val="000000"/>
           <w:sz w:val="52"/>
         </w:rPr>
         <w:t>技术报告</w:t>
@@ -70,7 +70,7 @@
           <w:rFonts w:ascii="宋体" w:hAnsi="宋体" w:eastAsia="宋体"/>
           <w:sz w:val="26"/>
         </w:rPr>
-        <w:t>团队名称：________________</w:t>
+        <w:t>团队名称：启源者</w:t>
       </w:r>
     </w:p>
     <w:p>
@@ -83,7 +83,7 @@
           <w:rFonts w:ascii="宋体" w:hAnsi="宋体" w:eastAsia="宋体"/>
           <w:sz w:val="26"/>
         </w:rPr>
-        <w:t>参赛编号：AIC-2026-________</w:t>
+        <w:t>参赛编号：AIC-2026-38933619</w:t>
       </w:r>
     </w:p>
     <w:p>
@@ -109,7 +109,7 @@
           <w:rFonts w:ascii="宋体" w:hAnsi="宋体" w:eastAsia="宋体"/>
           <w:sz w:val="26"/>
         </w:rPr>
-        <w:t>日期：2026年__月__日</w:t>
+        <w:t>日期：2026年10月27日</w:t>
       </w:r>
     </w:p>
     <w:p>

</xml_diff>

<commit_message>
Add implementation snippets to technical report
</commit_message>
<xml_diff>
--- a/deliverables/ReproGuard技术报告-模板版.docx
+++ b/deliverables/ReproGuard技术报告-模板版.docx
@@ -526,6 +526,112 @@
       </w:pPr>
       <w:r>
         <w:t>当前局限包括真实人工评测样本较小、缺少正常负类、尚未完成公开仓库的@v1跨仓库验收，以及跨学科支持目前主要是参数Schema和数字材料审查。</w:t>
+      </w:r>
+    </w:p>
+    <w:p>
+      <w:pPr>
+        <w:pStyle w:val="Heading2"/>
+      </w:pPr>
+      <w:r>
+        <w:t>关键实现片段</w:t>
+      </w:r>
+    </w:p>
+    <w:p>
+      <w:pPr>
+        <w:ind w:firstLine="420"/>
+      </w:pPr>
+      <w:r>
+        <w:t>报告仅列出能够说明自主实现边界的短代码片段；完整源码、测试用例和 Action 配置已放在 GitHub 仓库。</w:t>
+      </w:r>
+    </w:p>
+    <w:p>
+      <w:pPr>
+        <w:pStyle w:val="Heading3"/>
+      </w:pPr>
+      <w:r>
+        <w:t>Action 接入方式</w:t>
+      </w:r>
+    </w:p>
+    <w:p>
+      <w:pPr>
+        <w:spacing w:after="120"/>
+        <w:ind w:left="283" w:right="283"/>
+      </w:pPr>
+      <w:r>
+        <w:rPr>
+          <w:rFonts w:ascii="Consolas" w:hAnsi="Consolas" w:eastAsia="Consolas"/>
+          <w:color w:val="282828"/>
+          <w:sz w:val="18"/>
+        </w:rPr>
+        <w:t>uses: hm10629/reproguard@v1</w:t>
+        <w:br/>
+        <w:t>with:</w:t>
+        <w:br/>
+        <w:t xml:space="preserve">  constraints: docs/experiment-protocol.md</w:t>
+        <w:br/>
+        <w:t xml:space="preserve">  output: reproguard-report</w:t>
+      </w:r>
+    </w:p>
+    <w:p>
+      <w:pPr>
+        <w:pStyle w:val="Heading3"/>
+      </w:pPr>
+      <w:r>
+        <w:t>PR001 风险识别逻辑（简化）</w:t>
+      </w:r>
+    </w:p>
+    <w:p>
+      <w:pPr>
+        <w:spacing w:after="120"/>
+        <w:ind w:left="283" w:right="283"/>
+      </w:pPr>
+      <w:r>
+        <w:rPr>
+          <w:rFonts w:ascii="Consolas" w:hAnsi="Consolas" w:eastAsia="Consolas"/>
+          <w:color w:val="282828"/>
+          <w:sz w:val="18"/>
+        </w:rPr>
+        <w:t>for change in diff.changes:</w:t>
+        <w:br/>
+        <w:t xml:space="preserve">  if change.name in SCIENTIFIC_PARAMETERS:</w:t>
+        <w:br/>
+        <w:t xml:space="preserve">    risk = compare_with_constraints(change, protocol)</w:t>
+        <w:br/>
+        <w:t xml:space="preserve">    emit_risk(rule=change.rule_id, location=change.location,</w:t>
+        <w:br/>
+        <w:t xml:space="preserve">              status="needs_review", evidence=risk.evidence)</w:t>
+      </w:r>
+    </w:p>
+    <w:p>
+      <w:pPr>
+        <w:pStyle w:val="Heading3"/>
+      </w:pPr>
+      <w:r>
+        <w:t>结构化输出示例</w:t>
+      </w:r>
+    </w:p>
+    <w:p>
+      <w:pPr>
+        <w:spacing w:after="120"/>
+        <w:ind w:left="283" w:right="283"/>
+      </w:pPr>
+      <w:r>
+        <w:rPr>
+          <w:rFonts w:ascii="Consolas" w:hAnsi="Consolas" w:eastAsia="Consolas"/>
+          <w:color w:val="282828"/>
+          <w:sz w:val="18"/>
+        </w:rPr>
+        <w:t>{</w:t>
+        <w:br/>
+        <w:t xml:space="preserve">  "rule": "PR001", "risk": "medium",</w:t>
+        <w:br/>
+        <w:t xml:space="preserve">  "location": "train.py:3",</w:t>
+        <w:br/>
+        <w:t xml:space="preserve">  "evidence": "experiment-protocol.md#training",</w:t>
+        <w:br/>
+        <w:t xml:space="preserve">  "status": "needs_review"</w:t>
+        <w:br/>
+        <w:t>}</w:t>
       </w:r>
     </w:p>
     <w:p>

</xml_diff>